<commit_message>
Add Nano relay test firmware and wiring guide
</commit_message>
<xml_diff>
--- a/docs/Benchy_Kira_03_Assembly_Guide.docx
+++ b/docs/Benchy_Kira_03_Assembly_Guide.docx
@@ -111,7 +111,7 @@
               <w:t>CURRENT RELEASE STATUS</w:t>
             </w:r>
             <w:r>
-              <w:t xml:space="preserve">  This guide supports printing, dry-fitting, and mechanical assembly of the documented prototype. The exact hardware variants, screw lengths, internal wiring, firmware, and validated print profile have not yet been released. Do not use this document as electrical wiring or commissioning instructions.</w:t>
+              <w:t xml:space="preserve">  This guide supports printing, dry-fitting, and mechanical assembly of the documented prototype. The exact hardware variants, screw lengths, final control integration, internal wiring, and validated print profile have not yet been released. Do not use this document as electrical wiring or commissioning instructions.</w:t>
             </w:r>
           </w:p>
         </w:tc>
@@ -542,7 +542,7 @@
               <w:rPr>
                 <w:sz w:val="17"/>
               </w:rPr>
-              <w:t>Exact board, mounting, pin map, and program remain to be documented.</w:t>
+              <w:t>A D2-button/D7-relay test sketch is included; exact board and final integration remain to be confirmed.</w:t>
             </w:r>
           </w:p>
         </w:tc>
@@ -1920,7 +1920,7 @@
         <w:pStyle w:val="ListBullet"/>
       </w:pPr>
       <w:r>
-        <w:t>Nano firmware, pin assignments, relay state during startup/reset/failure, and output-enable behavior.</w:t>
+        <w:t>Final Nano behavior, relay state during startup/reset/failure, the switched circuit, and output-enable behavior.</w:t>
       </w:r>
     </w:p>
     <w:p>
@@ -2035,6 +2035,466 @@
       </w:r>
       <w:r>
         <w:t>A second person can reproduce the build using only the released files.</w:t>
+      </w:r>
+    </w:p>
+    <w:p>
+      <w:r>
+        <w:br w:type="page"/>
+      </w:r>
+    </w:p>
+    <w:p>
+      <w:pPr>
+        <w:pStyle w:val="Heading1"/>
+      </w:pPr>
+      <w:r>
+        <w:t>Arduino Nano and relay-module bench test</w:t>
+      </w:r>
+    </w:p>
+    <w:p>
+      <w:r>
+        <w:t>Use this reference circuit to test the pushbutton and relay-control logic before any relay contact is connected to the power supply. It assumes a verified 5 V logic-compatible relay module. Power the Nano by USB and leave COM, NO, and NC disconnected.</w:t>
+      </w:r>
+    </w:p>
+    <w:p>
+      <w:pPr>
+        <w:jc w:val="center"/>
+      </w:pPr>
+      <w:r>
+        <w:drawing>
+          <wp:inline xmlns:a="http://schemas.openxmlformats.org/drawingml/2006/main" xmlns:pic="http://schemas.openxmlformats.org/drawingml/2006/picture">
+            <wp:extent cx="6172200" cy="3857625"/>
+            <wp:docPr id="3" name="Picture 3"/>
+            <wp:cNvGraphicFramePr>
+              <a:graphicFrameLocks noChangeAspect="1"/>
+            </wp:cNvGraphicFramePr>
+            <a:graphic>
+              <a:graphicData uri="http://schemas.openxmlformats.org/drawingml/2006/picture">
+                <pic:pic>
+                  <pic:nvPicPr>
+                    <pic:cNvPr id="0" name="nano-relay-test.png"/>
+                    <pic:cNvPicPr/>
+                  </pic:nvPicPr>
+                  <pic:blipFill>
+                    <a:blip r:embed="rId14"/>
+                    <a:stretch>
+                      <a:fillRect/>
+                    </a:stretch>
+                  </pic:blipFill>
+                  <pic:spPr>
+                    <a:xfrm>
+                      <a:off x="0" y="0"/>
+                      <a:ext cx="6172200" cy="3857625"/>
+                    </a:xfrm>
+                    <a:prstGeom prst="rect"/>
+                  </pic:spPr>
+                </pic:pic>
+              </a:graphicData>
+            </a:graphic>
+          </wp:inline>
+        </w:drawing>
+      </w:r>
+    </w:p>
+    <w:p>
+      <w:pPr>
+        <w:jc w:val="center"/>
+      </w:pPr>
+      <w:r>
+        <w:rPr>
+          <w:i/>
+          <w:color w:val="5B6573"/>
+          <w:sz w:val="16"/>
+        </w:rPr>
+        <w:t>Reference test: D2 button input, D7 relay-module input, shared 5 V and GND.</w:t>
+      </w:r>
+    </w:p>
+    <w:p>
+      <w:pPr>
+        <w:pStyle w:val="Heading2"/>
+      </w:pPr>
+      <w:r>
+        <w:t>Pin map and test sequence</w:t>
+      </w:r>
+    </w:p>
+    <w:tbl>
+      <w:tblPr>
+        <w:tblW w:type="auto" w:w="0"/>
+        <w:jc w:val="center"/>
+        <w:tblLayout w:type="fixed"/>
+        <w:tblLook w:firstColumn="1" w:firstRow="1" w:lastColumn="0" w:lastRow="0" w:noHBand="0" w:noVBand="1" w:val="04A0"/>
+        <w:tblBorders>
+          <w:top w:val="single" w:sz="5" w:color="B7C7D9"/>
+          <w:left w:val="single" w:sz="5" w:color="B7C7D9"/>
+          <w:bottom w:val="single" w:sz="5" w:color="B7C7D9"/>
+          <w:right w:val="single" w:sz="5" w:color="B7C7D9"/>
+          <w:insideH w:val="single" w:sz="5" w:color="B7C7D9"/>
+          <w:insideV w:val="single" w:sz="5" w:color="B7C7D9"/>
+        </w:tblBorders>
+      </w:tblPr>
+      <w:tblGrid>
+        <w:gridCol w:w="3456"/>
+        <w:gridCol w:w="3456"/>
+        <w:gridCol w:w="3456"/>
+      </w:tblGrid>
+      <w:tr>
+        <w:tc>
+          <w:tcPr>
+            <w:tcW w:type="dxa" w:w="1296"/>
+            <w:shd w:fill="17365D"/>
+            <w:tcMar>
+              <w:top w:w="95" w:type="dxa"/>
+              <w:start w:w="110" w:type="dxa"/>
+              <w:bottom w:w="95" w:type="dxa"/>
+              <w:end w:w="110" w:type="dxa"/>
+            </w:tcMar>
+          </w:tcPr>
+          <w:p>
+            <w:r>
+              <w:rPr>
+                <w:b/>
+                <w:color w:val="FFFFFF"/>
+              </w:rPr>
+              <w:t>Nano</w:t>
+            </w:r>
+          </w:p>
+        </w:tc>
+        <w:tc>
+          <w:tcPr>
+            <w:tcW w:type="dxa" w:w="3240"/>
+            <w:shd w:fill="17365D"/>
+            <w:tcMar>
+              <w:top w:w="95" w:type="dxa"/>
+              <w:start w:w="110" w:type="dxa"/>
+              <w:bottom w:w="95" w:type="dxa"/>
+              <w:end w:w="110" w:type="dxa"/>
+            </w:tcMar>
+          </w:tcPr>
+          <w:p>
+            <w:r>
+              <w:rPr>
+                <w:b/>
+                <w:color w:val="FFFFFF"/>
+              </w:rPr>
+              <w:t>Connect to</w:t>
+            </w:r>
+          </w:p>
+        </w:tc>
+        <w:tc>
+          <w:tcPr>
+            <w:tcW w:type="dxa" w:w="4968"/>
+            <w:shd w:fill="17365D"/>
+            <w:tcMar>
+              <w:top w:w="95" w:type="dxa"/>
+              <w:start w:w="110" w:type="dxa"/>
+              <w:bottom w:w="95" w:type="dxa"/>
+              <w:end w:w="110" w:type="dxa"/>
+            </w:tcMar>
+          </w:tcPr>
+          <w:p>
+            <w:r>
+              <w:rPr>
+                <w:b/>
+                <w:color w:val="FFFFFF"/>
+              </w:rPr>
+              <w:t>Function</w:t>
+            </w:r>
+          </w:p>
+        </w:tc>
+      </w:tr>
+      <w:tr>
+        <w:tc>
+          <w:tcPr>
+            <w:tcW w:type="dxa" w:w="1296"/>
+            <w:tcMar>
+              <w:top w:w="95" w:type="dxa"/>
+              <w:start w:w="110" w:type="dxa"/>
+              <w:bottom w:w="95" w:type="dxa"/>
+              <w:end w:w="110" w:type="dxa"/>
+            </w:tcMar>
+          </w:tcPr>
+          <w:p>
+            <w:r>
+              <w:rPr>
+                <w:sz w:val="17"/>
+              </w:rPr>
+              <w:t>D2</w:t>
+            </w:r>
+          </w:p>
+        </w:tc>
+        <w:tc>
+          <w:tcPr>
+            <w:tcW w:type="dxa" w:w="3240"/>
+            <w:tcMar>
+              <w:top w:w="95" w:type="dxa"/>
+              <w:start w:w="110" w:type="dxa"/>
+              <w:bottom w:w="95" w:type="dxa"/>
+              <w:end w:w="110" w:type="dxa"/>
+            </w:tcMar>
+          </w:tcPr>
+          <w:p>
+            <w:r>
+              <w:rPr>
+                <w:sz w:val="17"/>
+              </w:rPr>
+              <w:t>Momentary button to GND</w:t>
+            </w:r>
+          </w:p>
+        </w:tc>
+        <w:tc>
+          <w:tcPr>
+            <w:tcW w:type="dxa" w:w="4968"/>
+            <w:tcMar>
+              <w:top w:w="95" w:type="dxa"/>
+              <w:start w:w="110" w:type="dxa"/>
+              <w:bottom w:w="95" w:type="dxa"/>
+              <w:end w:w="110" w:type="dxa"/>
+            </w:tcMar>
+          </w:tcPr>
+          <w:p>
+            <w:r>
+              <w:rPr>
+                <w:sz w:val="17"/>
+              </w:rPr>
+              <w:t>Debounced INPUT_PULLUP control; press toggles requested state</w:t>
+            </w:r>
+          </w:p>
+        </w:tc>
+      </w:tr>
+      <w:tr>
+        <w:tc>
+          <w:tcPr>
+            <w:tcW w:type="dxa" w:w="1296"/>
+            <w:tcMar>
+              <w:top w:w="95" w:type="dxa"/>
+              <w:start w:w="110" w:type="dxa"/>
+              <w:bottom w:w="95" w:type="dxa"/>
+              <w:end w:w="110" w:type="dxa"/>
+            </w:tcMar>
+            <w:shd w:fill="EAF1F8"/>
+          </w:tcPr>
+          <w:p>
+            <w:r>
+              <w:rPr>
+                <w:sz w:val="17"/>
+              </w:rPr>
+              <w:t>D7</w:t>
+            </w:r>
+          </w:p>
+        </w:tc>
+        <w:tc>
+          <w:tcPr>
+            <w:tcW w:type="dxa" w:w="3240"/>
+            <w:tcMar>
+              <w:top w:w="95" w:type="dxa"/>
+              <w:start w:w="110" w:type="dxa"/>
+              <w:bottom w:w="95" w:type="dxa"/>
+              <w:end w:w="110" w:type="dxa"/>
+            </w:tcMar>
+            <w:shd w:fill="EAF1F8"/>
+          </w:tcPr>
+          <w:p>
+            <w:r>
+              <w:rPr>
+                <w:sz w:val="17"/>
+              </w:rPr>
+              <w:t>Relay-module IN</w:t>
+            </w:r>
+          </w:p>
+        </w:tc>
+        <w:tc>
+          <w:tcPr>
+            <w:tcW w:type="dxa" w:w="4968"/>
+            <w:tcMar>
+              <w:top w:w="95" w:type="dxa"/>
+              <w:start w:w="110" w:type="dxa"/>
+              <w:bottom w:w="95" w:type="dxa"/>
+              <w:end w:w="110" w:type="dxa"/>
+            </w:tcMar>
+            <w:shd w:fill="EAF1F8"/>
+          </w:tcPr>
+          <w:p>
+            <w:r>
+              <w:rPr>
+                <w:sz w:val="17"/>
+              </w:rPr>
+              <w:t>Configurable logic output; sketch defaults to active low</w:t>
+            </w:r>
+          </w:p>
+        </w:tc>
+      </w:tr>
+      <w:tr>
+        <w:tc>
+          <w:tcPr>
+            <w:tcW w:type="dxa" w:w="1296"/>
+            <w:tcMar>
+              <w:top w:w="95" w:type="dxa"/>
+              <w:start w:w="110" w:type="dxa"/>
+              <w:bottom w:w="95" w:type="dxa"/>
+              <w:end w:w="110" w:type="dxa"/>
+            </w:tcMar>
+          </w:tcPr>
+          <w:p>
+            <w:r>
+              <w:rPr>
+                <w:sz w:val="17"/>
+              </w:rPr>
+              <w:t>5V</w:t>
+            </w:r>
+          </w:p>
+        </w:tc>
+        <w:tc>
+          <w:tcPr>
+            <w:tcW w:type="dxa" w:w="3240"/>
+            <w:tcMar>
+              <w:top w:w="95" w:type="dxa"/>
+              <w:start w:w="110" w:type="dxa"/>
+              <w:bottom w:w="95" w:type="dxa"/>
+              <w:end w:w="110" w:type="dxa"/>
+            </w:tcMar>
+          </w:tcPr>
+          <w:p>
+            <w:r>
+              <w:rPr>
+                <w:sz w:val="17"/>
+              </w:rPr>
+              <w:t>Relay-module VCC</w:t>
+            </w:r>
+          </w:p>
+        </w:tc>
+        <w:tc>
+          <w:tcPr>
+            <w:tcW w:type="dxa" w:w="4968"/>
+            <w:tcMar>
+              <w:top w:w="95" w:type="dxa"/>
+              <w:start w:w="110" w:type="dxa"/>
+              <w:bottom w:w="95" w:type="dxa"/>
+              <w:end w:w="110" w:type="dxa"/>
+            </w:tcMar>
+          </w:tcPr>
+          <w:p>
+            <w:r>
+              <w:rPr>
+                <w:sz w:val="17"/>
+              </w:rPr>
+              <w:t>Only for a verified 5 V module during the USB bench test</w:t>
+            </w:r>
+          </w:p>
+        </w:tc>
+      </w:tr>
+      <w:tr>
+        <w:tc>
+          <w:tcPr>
+            <w:tcW w:type="dxa" w:w="1296"/>
+            <w:tcMar>
+              <w:top w:w="95" w:type="dxa"/>
+              <w:start w:w="110" w:type="dxa"/>
+              <w:bottom w:w="95" w:type="dxa"/>
+              <w:end w:w="110" w:type="dxa"/>
+            </w:tcMar>
+            <w:shd w:fill="EAF1F8"/>
+          </w:tcPr>
+          <w:p>
+            <w:r>
+              <w:rPr>
+                <w:sz w:val="17"/>
+              </w:rPr>
+              <w:t>GND</w:t>
+            </w:r>
+          </w:p>
+        </w:tc>
+        <w:tc>
+          <w:tcPr>
+            <w:tcW w:type="dxa" w:w="3240"/>
+            <w:tcMar>
+              <w:top w:w="95" w:type="dxa"/>
+              <w:start w:w="110" w:type="dxa"/>
+              <w:bottom w:w="95" w:type="dxa"/>
+              <w:end w:w="110" w:type="dxa"/>
+            </w:tcMar>
+            <w:shd w:fill="EAF1F8"/>
+          </w:tcPr>
+          <w:p>
+            <w:r>
+              <w:rPr>
+                <w:sz w:val="17"/>
+              </w:rPr>
+              <w:t>Relay GND and button return</w:t>
+            </w:r>
+          </w:p>
+        </w:tc>
+        <w:tc>
+          <w:tcPr>
+            <w:tcW w:type="dxa" w:w="4968"/>
+            <w:tcMar>
+              <w:top w:w="95" w:type="dxa"/>
+              <w:start w:w="110" w:type="dxa"/>
+              <w:bottom w:w="95" w:type="dxa"/>
+              <w:end w:w="110" w:type="dxa"/>
+            </w:tcMar>
+            <w:shd w:fill="EAF1F8"/>
+          </w:tcPr>
+          <w:p>
+            <w:r>
+              <w:rPr>
+                <w:sz w:val="17"/>
+              </w:rPr>
+              <w:t>Shared low-voltage reference</w:t>
+            </w:r>
+          </w:p>
+        </w:tc>
+      </w:tr>
+    </w:tbl>
+    <w:p>
+      <w:pPr>
+        <w:spacing w:before="140"/>
+      </w:pPr>
+      <w:r>
+        <w:rPr>
+          <w:b/>
+        </w:rPr>
+        <w:t xml:space="preserve">Sketch: </w:t>
+      </w:r>
+      <w:r>
+        <w:t>firmware/benchy_relay_test/benchy_relay_test.ino</w:t>
+      </w:r>
+    </w:p>
+    <w:p>
+      <w:pPr>
+        <w:pStyle w:val="ListBullet"/>
+      </w:pPr>
+      <w:r>
+        <w:t>Open the sketch in Arduino IDE and select the exact Nano board and processor/bootloader.</w:t>
+      </w:r>
+    </w:p>
+    <w:p>
+      <w:pPr>
+        <w:pStyle w:val="ListBullet"/>
+      </w:pPr>
+      <w:r>
+        <w:t>Upload by USB with the relay contacts disconnected; open Serial Monitor at 9600 baud.</w:t>
+      </w:r>
+    </w:p>
+    <w:p>
+      <w:pPr>
+        <w:pStyle w:val="ListBullet"/>
+      </w:pPr>
+      <w:r>
+        <w:t>Confirm Relay OFF at startup and one clean ON/OFF change for each button press.</w:t>
+      </w:r>
+    </w:p>
+    <w:p>
+      <w:pPr>
+        <w:pStyle w:val="ListBullet"/>
+      </w:pPr>
+      <w:r>
+        <w:t>Verify the relay module's active level. Change RELAY_ACTIVE_LOW only when its documentation requires it.</w:t>
+      </w:r>
+    </w:p>
+    <w:p>
+      <w:pPr>
+        <w:pStyle w:val="ListBullet"/>
+      </w:pPr>
+      <w:r>
+        <w:t>Do not connect a bare relay coil directly to D7 and do not use this test circuit to switch mains voltage.</w:t>
       </w:r>
     </w:p>
     <w:sectPr>

</xml_diff>